<commit_message>
Documentation v1.1: reflect security/performance/SEO hardening
- New 3.4 Performance measures section (LCP fetchPriority, asset caching,
  lazy loading, zero-JS banner animation)
- Security posture: per-IP rate limits on all email routes documented
- SEO: robots /api/ exclusion + X-Robots-Tag noted
- Limitations: rate-limiting gap replaced with the per-instance caveat
- Services spreadsheet: API Routes sheet carries each route's rate limit

Co-Authored-By: Claude Fable 5 <noreply@anthropic.com>
Claude-Session: https://claude.ai/code/session_018A5h36uWK4kcZoHCyNmetT
</commit_message>
<xml_diff>
--- a/docs/dareomotosho-website-documentation.docx
+++ b/docs/dareomotosho-website-documentation.docx
@@ -63,7 +63,7 @@
           <w:sz w:val="20"/>
           <w:szCs w:val="20"/>
         </w:rPr>
-        <w:t xml:space="preserve">Version 1.0 · July 2026 · Repository: Career-RoadMap/dareomotosho</w:t>
+        <w:t xml:space="preserve">Version 1.1 · July 2026 · Repository: Career-RoadMap/dareomotosho</w:t>
       </w:r>
     </w:p>
     <w:p>
@@ -1596,7 +1596,7 @@
                 <w:sz w:val="19"/>
                 <w:szCs w:val="19"/>
               </w:rPr>
-              <w:t xml:space="preserve">site.ts (brand constants, nav, banners), pathfinder.ts (questions, scoring, tracks, temperaments), library.ts + content.ts (Supabase reads), supabase.ts (client), email.ts (sender sanitizing), report-pdf.tsx (PDF document), downloads.ts.</w:t>
+              <w:t xml:space="preserve">site.ts (brand constants, nav, banners), pathfinder.ts (questions, scoring, tracks, temperaments), library.ts + content.ts (Supabase reads), supabase.ts (client), email.ts (sender sanitizing + shared HTML escaping), rate-limit.ts (per-IP fixed-window limiter), report-pdf.tsx (PDF document), downloads.ts.</w:t>
             </w:r>
           </w:p>
         </w:tc>
@@ -1938,6 +1938,97 @@
         </w:tc>
       </w:tr>
     </w:tbl>
+    <w:p>
+      <w:pPr>
+        <w:pStyle w:val="Heading2"/>
+        <w:spacing w:after="120" w:before="240"/>
+      </w:pPr>
+      <w:r>
+        <w:rPr>
+          <w:rFonts w:ascii="Calibri" w:cs="Calibri" w:eastAsia="Calibri" w:hAnsi="Calibri"/>
+          <w:b/>
+          <w:bCs/>
+          <w:color w:val="1E3A5F"/>
+        </w:rPr>
+        <w:t xml:space="preserve">3.4 Performance measures</w:t>
+      </w:r>
+    </w:p>
+    <w:p>
+      <w:pPr>
+        <w:pStyle w:val="ListParagraph"/>
+        <w:numPr>
+          <w:ilvl w:val="0"/>
+          <w:numId w:val="2"/>
+        </w:numPr>
+        <w:spacing w:after="80" w:line="276"/>
+      </w:pPr>
+      <w:r>
+        <w:rPr>
+          <w:rFonts w:ascii="Calibri" w:cs="Calibri" w:eastAsia="Calibri" w:hAnsi="Calibri"/>
+          <w:color w:val="0F1B2D"/>
+          <w:sz w:val="21"/>
+          <w:szCs w:val="21"/>
+        </w:rPr>
+        <w:t xml:space="preserve">The page banner SVG is the LCP element on every page; it loads with fetchPriority=high and async decoding.</w:t>
+      </w:r>
+    </w:p>
+    <w:p>
+      <w:pPr>
+        <w:pStyle w:val="ListParagraph"/>
+        <w:numPr>
+          <w:ilvl w:val="0"/>
+          <w:numId w:val="2"/>
+        </w:numPr>
+        <w:spacing w:after="80" w:line="276"/>
+      </w:pPr>
+      <w:r>
+        <w:rPr>
+          <w:rFonts w:ascii="Calibri" w:cs="Calibri" w:eastAsia="Calibri" w:hAnsi="Calibri"/>
+          <w:color w:val="0F1B2D"/>
+          <w:sz w:val="21"/>
+          <w:szCs w:val="21"/>
+        </w:rPr>
+        <w:t xml:space="preserve">/banners and /portraits assets are served with Cache-Control: public, max-age=86400, stale-while-revalidate=604800 (previously uncached), so repeat navigation stops re-fetching artwork.</w:t>
+      </w:r>
+    </w:p>
+    <w:p>
+      <w:pPr>
+        <w:pStyle w:val="ListParagraph"/>
+        <w:numPr>
+          <w:ilvl w:val="0"/>
+          <w:numId w:val="2"/>
+        </w:numPr>
+        <w:spacing w:after="80" w:line="276"/>
+      </w:pPr>
+      <w:r>
+        <w:rPr>
+          <w:rFonts w:ascii="Calibri" w:cs="Calibri" w:eastAsia="Calibri" w:hAnsi="Calibri"/>
+          <w:color w:val="0F1B2D"/>
+          <w:sz w:val="21"/>
+          <w:szCs w:val="21"/>
+        </w:rPr>
+        <w:t xml:space="preserve">Below-fold images (the YouTube thumbnail) lazy-load; the about portrait decodes off the main thread.</w:t>
+      </w:r>
+    </w:p>
+    <w:p>
+      <w:pPr>
+        <w:pStyle w:val="ListParagraph"/>
+        <w:numPr>
+          <w:ilvl w:val="0"/>
+          <w:numId w:val="2"/>
+        </w:numPr>
+        <w:spacing w:after="80" w:line="276"/>
+      </w:pPr>
+      <w:r>
+        <w:rPr>
+          <w:rFonts w:ascii="Calibri" w:cs="Calibri" w:eastAsia="Calibri" w:hAnsi="Calibri"/>
+          <w:color w:val="0F1B2D"/>
+          <w:sz w:val="21"/>
+          <w:szCs w:val="21"/>
+        </w:rPr>
+        <w:t xml:space="preserve">Banner line animations are CSS embedded inside the SVG files — zero JavaScript cost; preconnects warm the Supabase and i.ytimg.com origins; fonts load via next/font with display swap.</w:t>
+      </w:r>
+    </w:p>
     <w:p>
       <w:pPr>
         <w:pStyle w:val="Heading1"/>
@@ -3099,6 +3190,25 @@
     </w:p>
     <w:p>
       <w:pPr>
+        <w:pStyle w:val="ListParagraph"/>
+        <w:numPr>
+          <w:ilvl w:val="0"/>
+          <w:numId w:val="2"/>
+        </w:numPr>
+        <w:spacing w:after="80" w:line="276"/>
+      </w:pPr>
+      <w:r>
+        <w:rPr>
+          <w:rFonts w:ascii="Calibri" w:cs="Calibri" w:eastAsia="Calibri" w:hAnsi="Calibri"/>
+          <w:color w:val="0F1B2D"/>
+          <w:sz w:val="21"/>
+          <w:szCs w:val="21"/>
+        </w:rPr>
+        <w:t xml:space="preserve">robots.txt disallows /api/ and every /api/* response carries X-Robots-Tag: noindex, nofollow — API endpoints are not pages, and crawling /api/contact?send=test would fire a real email.</w:t>
+      </w:r>
+    </w:p>
+    <w:p>
+      <w:pPr>
         <w:pStyle w:val="Heading2"/>
         <w:spacing w:after="120" w:before="240"/>
       </w:pPr>
@@ -3139,6 +3249,36 @@
           <w:color w:val="1E3A5F"/>
         </w:rPr>
         <w:t xml:space="preserve">7. Security Posture</w:t>
+      </w:r>
+    </w:p>
+    <w:p>
+      <w:pPr>
+        <w:pStyle w:val="ListParagraph"/>
+        <w:numPr>
+          <w:ilvl w:val="0"/>
+          <w:numId w:val="2"/>
+        </w:numPr>
+        <w:spacing w:after="80" w:line="276"/>
+      </w:pPr>
+      <w:r>
+        <w:rPr>
+          <w:rFonts w:ascii="Calibri" w:cs="Calibri" w:eastAsia="Calibri" w:hAnsi="Calibri"/>
+          <w:b/>
+          <w:bCs/>
+          <w:color w:val="0F1B2D"/>
+          <w:sz w:val="21"/>
+          <w:szCs w:val="21"/>
+        </w:rPr>
+        <w:t xml:space="preserve">Per-IP rate limiting on every email-sending route</w:t>
+      </w:r>
+      <w:r>
+        <w:rPr>
+          <w:rFonts w:ascii="Calibri" w:cs="Calibri" w:eastAsia="Calibri" w:hAnsi="Calibri"/>
+          <w:color w:val="0F1B2D"/>
+          <w:sz w:val="21"/>
+          <w:szCs w:val="21"/>
+        </w:rPr>
+        <w:t xml:space="preserve"> (lib/rate-limit.ts, in-memory fixed window, no dependencies): contact form 5 requests / 10 min, results email 5 / 10 min, subscribe 8 / 10 min, and the contact ?send=test diagnostic 2 / 10 min — so a bot loop cannot burn the Resend daily quota. Excess requests get HTTP 429 with a human-readable message the forms display.</w:t>
       </w:r>
     </w:p>
     <w:p>
@@ -5630,7 +5770,7 @@
           <w:sz w:val="21"/>
           <w:szCs w:val="21"/>
         </w:rPr>
-        <w:t xml:space="preserve">The email/subscribe endpoints have input validation and length caps but no rate limiting; abuse would consume the Resend daily quota. A simple IP-based limiter (or Vercel WAF rules) is the next step.</w:t>
+        <w:t xml:space="preserve">The rate limiter is in-memory and therefore per serverless instance — the right zero-dependency fit for this traffic profile, but sustained distributed abuse across many instances would dilute it. The upgrade path is Vercel WAF rules or a Redis-backed limiter.</w:t>
       </w:r>
     </w:p>
     <w:p>
@@ -5699,7 +5839,7 @@
         </w:rPr>
         <w:t xml:space="preserve">The service inventory is maintained in Excel alongside this document: </w:t>
       </w:r>
-      <w:hyperlink w:history="1" r:id="rIdja0a9yferhv2_0im-n52s">
+      <w:hyperlink w:history="1" r:id="rIdgyn26d-vijqkibxmdqur3">
         <w:r>
           <w:rPr>
             <w:rStyle w:val="Hyperlink"/>
@@ -5719,7 +5859,7 @@
         </w:rPr>
         <w:t xml:space="preserve"> (same folder as this file), also on GitHub: </w:t>
       </w:r>
-      <w:hyperlink w:history="1" r:id="rIdk-jxbulauk0txmoiy18mr">
+      <w:hyperlink w:history="1" r:id="rIdsqijkveefjvrzaiys4xun">
         <w:r>
           <w:rPr>
             <w:rStyle w:val="Hyperlink"/>

</xml_diff>

<commit_message>
Booking moves to Calendly (35-minute calls)
- bookingUrl now points at calendly.com/darelekan46/35min
- /book page copy updated (35 minutes, Calendly wording)
- Privacy policy processor entry: Google Calendar replaced with Calendly
- Documentation + services spreadsheet regenerated to match

Co-Authored-By: Claude Fable 5 <noreply@anthropic.com>
Claude-Session: https://claude.ai/code/session_018A5h36uWK4kcZoHCyNmetT
</commit_message>
<xml_diff>
--- a/docs/dareomotosho-website-documentation.docx
+++ b/docs/dareomotosho-website-documentation.docx
@@ -246,7 +246,7 @@
           <w:sz w:val="21"/>
           <w:szCs w:val="21"/>
         </w:rPr>
-        <w:t xml:space="preserve">Booking (Google Calendar appointment schedule), inquiry forms, an email subscriber list, and an RSS feed with WebSub push.</w:t>
+        <w:t xml:space="preserve">Booking (Calendly, 35-minute calls), inquiry forms, an email subscriber list, and an RSS feed with WebSub push.</w:t>
       </w:r>
     </w:p>
     <w:p>
@@ -5839,7 +5839,7 @@
         </w:rPr>
         <w:t xml:space="preserve">The service inventory is maintained in Excel alongside this document: </w:t>
       </w:r>
-      <w:hyperlink w:history="1" r:id="rIdgyn26d-vijqkibxmdqur3">
+      <w:hyperlink w:history="1" r:id="rIdahxmzk70nhebwyoscmn53">
         <w:r>
           <w:rPr>
             <w:rStyle w:val="Hyperlink"/>
@@ -5859,7 +5859,7 @@
         </w:rPr>
         <w:t xml:space="preserve"> (same folder as this file), also on GitHub: </w:t>
       </w:r>
-      <w:hyperlink w:history="1" r:id="rIdsqijkveefjvrzaiys4xun">
+      <w:hyperlink w:history="1" r:id="rIdgqdjl_4dm3jajm3n3lryh">
         <w:r>
           <w:rPr>
             <w:rStyle w:val="Hyperlink"/>

</xml_diff>

<commit_message>
Booking copy reads 30 minutes
Co-Authored-By: Claude Fable 5 <noreply@anthropic.com>
Claude-Session: https://claude.ai/code/session_018A5h36uWK4kcZoHCyNmetT
</commit_message>
<xml_diff>
--- a/docs/dareomotosho-website-documentation.docx
+++ b/docs/dareomotosho-website-documentation.docx
@@ -246,7 +246,7 @@
           <w:sz w:val="21"/>
           <w:szCs w:val="21"/>
         </w:rPr>
-        <w:t xml:space="preserve">Booking (Calendly, 35-minute calls), inquiry forms, an email subscriber list, and an RSS feed with WebSub push.</w:t>
+        <w:t xml:space="preserve">Booking (Calendly, 30-minute calls), inquiry forms, an email subscriber list, and an RSS feed with WebSub push.</w:t>
       </w:r>
     </w:p>
     <w:p>
@@ -5839,7 +5839,7 @@
         </w:rPr>
         <w:t xml:space="preserve">The service inventory is maintained in Excel alongside this document: </w:t>
       </w:r>
-      <w:hyperlink w:history="1" r:id="rIdahxmzk70nhebwyoscmn53">
+      <w:hyperlink w:history="1" r:id="rIdthlunwwbjh60rktx5f2ju">
         <w:r>
           <w:rPr>
             <w:rStyle w:val="Hyperlink"/>
@@ -5859,7 +5859,7 @@
         </w:rPr>
         <w:t xml:space="preserve"> (same folder as this file), also on GitHub: </w:t>
       </w:r>
-      <w:hyperlink w:history="1" r:id="rIdgqdjl_4dm3jajm3n3lryh">
+      <w:hyperlink w:history="1" r:id="rIdncmn0w3ui5py4nwrnf6rs">
         <w:r>
           <w:rPr>
             <w:rStyle w:val="Hyperlink"/>

</xml_diff>

<commit_message>
Documentation: add 6.7 Reading bands (long-page rhythm)
Records the .band / .band-warm system, the alternation rule, the two
structural gotchas (container-content must move inward so the tint
bleeds; id and scroll-mt stay on the section), the 14% border weight,
and why the resources grid is left unbanded.

Co-Authored-By: Claude Fable 5 <noreply@anthropic.com>
Claude-Session: https://claude.ai/code/session_018A5h36uWK4kcZoHCyNmetT
</commit_message>
<xml_diff>
--- a/docs/dareomotosho-website-documentation.docx
+++ b/docs/dareomotosho-website-documentation.docx
@@ -3224,6 +3224,49 @@
     </w:p>
     <w:p>
       <w:pPr>
+        <w:pStyle w:val="Heading2"/>
+        <w:spacing w:after="120" w:before="240"/>
+      </w:pPr>
+      <w:r>
+        <w:rPr>
+          <w:rFonts w:ascii="Calibri" w:cs="Calibri" w:eastAsia="Calibri" w:hAnsi="Calibri"/>
+          <w:b/>
+          <w:bCs/>
+          <w:color w:val="1E3A5F"/>
+        </w:rPr>
+        <w:t xml:space="preserve">6.7 Reading bands (long-page rhythm)</w:t>
+      </w:r>
+    </w:p>
+    <w:p>
+      <w:pPr>
+        <w:spacing w:after="120" w:line="276"/>
+      </w:pPr>
+      <w:r>
+        <w:rPr>
+          <w:rFonts w:ascii="Calibri" w:cs="Calibri" w:eastAsia="Calibri" w:hAnsi="Calibri"/>
+          <w:color w:val="0F1B2D"/>
+          <w:sz w:val="21"/>
+          <w:szCs w:val="21"/>
+        </w:rPr>
+        <w:t xml:space="preserve">Long pages read as a sequence of distinct “pages” rather than one unbroken scroll. Two utilities in globals.css do the work: .band (a cool Ink tint at 3.5%) and .band-warm (a warm Amber tint at 6%), each closed with a hairline seam. Sections alternate Paper → band → Paper down the page, with the warm variant reserved for closing and invitation moments, and the existing dark Ink / Signature bands still used for statement moments. Every value is a tint of an existing brand token, so the strict five-color palette is unchanged.</w:t>
+      </w:r>
+    </w:p>
+    <w:p>
+      <w:pPr>
+        <w:spacing w:after="120" w:line="276"/>
+      </w:pPr>
+      <w:r>
+        <w:rPr>
+          <w:rFonts w:ascii="Calibri" w:cs="Calibri" w:eastAsia="Calibri" w:hAnsi="Calibri"/>
+          <w:color w:val="0F1B2D"/>
+          <w:sz w:val="21"/>
+          <w:szCs w:val="21"/>
+        </w:rPr>
+        <w:t xml:space="preserve">Two structural rules matter when adding a band. The tint must bleed edge to edge, so `container-content` moves from the &lt;section&gt; to an inner &lt;div&gt; while the section itself keeps any id and scroll-mt utilities — otherwise anchor links land at the wrong offset. And two bands must never sit adjacent, or their seams double up; alternate through Paper instead. Card and grid-divider lines are set at 14% Ink (raised from 10%) so borders stay crisp against the tinted surfaces. The /resources collection grid is deliberately left unbanded because it hosts the sticky Community Questions sidebar.</w:t>
+      </w:r>
+    </w:p>
+    <w:p>
+      <w:pPr>
         <w:spacing w:after="120" w:line="276"/>
       </w:pPr>
       <w:r>
@@ -5839,7 +5882,7 @@
         </w:rPr>
         <w:t xml:space="preserve">The service inventory is maintained in Excel alongside this document: </w:t>
       </w:r>
-      <w:hyperlink w:history="1" r:id="rIdthlunwwbjh60rktx5f2ju">
+      <w:hyperlink w:history="1" r:id="rIdx_lwo5gddgrpqxpfkn6zk">
         <w:r>
           <w:rPr>
             <w:rStyle w:val="Hyperlink"/>
@@ -5859,7 +5902,7 @@
         </w:rPr>
         <w:t xml:space="preserve"> (same folder as this file), also on GitHub: </w:t>
       </w:r>
-      <w:hyperlink w:history="1" r:id="rIdncmn0w3ui5py4nwrnf6rs">
+      <w:hyperlink w:history="1" r:id="rIdibjzwfmb_t2tjsbj4dsyh">
         <w:r>
           <w:rPr>
             <w:rStyle w:val="Hyperlink"/>

</xml_diff>